<commit_message>
Final audit: classroom procedure cards, fill bracketed blanks and remove draft language
</commit_message>
<xml_diff>
--- a/resources/systems/procedures/classroom/assigned-seating.docx
+++ b/resources/systems/procedures/classroom/assigned-seating.docx
@@ -1132,7 +1132,7 @@
           <w:sz w:val="34"/>
           <w:szCs w:val="34"/>
         </w:rPr>
-        <w:t xml:space="preserve">Teaching Assigned Seating: Sample Script</w:t>
+        <w:t>Teaching Assigned Seating: Script</w:t>
       </w:r>
     </w:p>
     <w:p>
@@ -1148,7 +1148,7 @@
           <w:sz w:val="18"/>
           <w:szCs w:val="18"/>
         </w:rPr>
-        <w:t xml:space="preserve">This is a sample script. It's meant to be taught, not read verbatim — add your own class's language, examples, and personality before you use it. Teach this before Day 1, not during it.</w:t>
+        <w:t>Use this script to teach the routine. Teach it before Day 1, not during it.</w:t>
       </w:r>
     </w:p>
     <w:p>
@@ -1669,7 +1669,7 @@
           <w:sz w:val="18"/>
           <w:szCs w:val="18"/>
         </w:rPr>
-        <w:t xml:space="preserve">Personalize before you teach it: build your own chart using your chosen structure (rows, pairs, pods of 3, or groups of 4), and base assignments on the behavior, academic, and accommodation needs you already know or are learning about your students.</w:t>
+        <w:t>Set before Day 1: the room's seating structure (rows, pairs, pods of 3, or groups of 4) and a chart based on the behavior, academic, and accommodation needs of the class.</w:t>
       </w:r>
     </w:p>
     <w:sectPr>

</xml_diff>